<commit_message>
refactored code for ex 2 slightly
</commit_message>
<xml_diff>
--- a/doc/ex2/proofs.docx
+++ b/doc/ex2/proofs.docx
@@ -2034,13 +2034,7 @@
           <w:rPr>
             <w:rFonts w:ascii="Cambria Math" w:hAnsi="Cambria Math"/>
           </w:rPr>
-          <m:t>…</m:t>
-        </m:r>
-        <m:r>
-          <w:rPr>
-            <w:rFonts w:ascii="Cambria Math" w:hAnsi="Cambria Math"/>
-          </w:rPr>
-          <m:t xml:space="preserve">, </m:t>
+          <m:t xml:space="preserve">…, </m:t>
         </m:r>
         <m:sSub>
           <m:sSubPr>
@@ -2412,25 +2406,7 @@
             <w:rPr>
               <w:rFonts w:ascii="Cambria Math" w:hAnsi="Cambria Math"/>
             </w:rPr>
-            <m:t xml:space="preserve">, </m:t>
-          </m:r>
-          <m:r>
-            <w:rPr>
-              <w:rFonts w:ascii="Cambria Math" w:hAnsi="Cambria Math"/>
-            </w:rPr>
-            <m:t xml:space="preserve"> </m:t>
-          </m:r>
-          <m:r>
-            <w:rPr>
-              <w:rFonts w:ascii="Cambria Math" w:hAnsi="Cambria Math"/>
-            </w:rPr>
-            <m:t>T</m:t>
-          </m:r>
-          <m:r>
-            <w:rPr>
-              <w:rFonts w:ascii="Cambria Math" w:hAnsi="Cambria Math"/>
-            </w:rPr>
-            <m:t>=number of fitness evaluations</m:t>
+            <m:t>,  T=number of fitness evaluations</m:t>
           </m:r>
         </m:oMath>
       </m:oMathPara>
@@ -2622,19 +2598,7 @@
                     <w:rPr>
                       <w:rFonts w:ascii="Cambria Math" w:hAnsi="Cambria Math"/>
                     </w:rPr>
-                    <m:t>X</m:t>
-                  </m:r>
-                  <m:r>
-                    <w:rPr>
-                      <w:rFonts w:ascii="Cambria Math" w:hAnsi="Cambria Math"/>
-                    </w:rPr>
-                    <m:t>≤</m:t>
-                  </m:r>
-                  <m:r>
-                    <w:rPr>
-                      <w:rFonts w:ascii="Cambria Math" w:hAnsi="Cambria Math"/>
-                    </w:rPr>
-                    <m:t>s∙E</m:t>
+                    <m:t>X≤s∙E</m:t>
                   </m:r>
                   <m:d>
                     <m:dPr>
@@ -3609,13 +3573,7 @@
           <w:rPr>
             <w:rFonts w:ascii="Cambria Math" w:hAnsi="Cambria Math"/>
           </w:rPr>
-          <m:t>=</m:t>
-        </m:r>
-        <m:r>
-          <w:rPr>
-            <w:rFonts w:ascii="Cambria Math" w:hAnsi="Cambria Math"/>
-          </w:rPr>
-          <m:t>O</m:t>
+          <m:t>=O</m:t>
         </m:r>
         <m:d>
           <m:dPr>
@@ -3876,13 +3834,7 @@
         <w:rPr>
           <w:rFonts w:ascii="Garamond" w:hAnsi="Garamond"/>
         </w:rPr>
-        <w:t xml:space="preserve">. </w:t>
-      </w:r>
-      <w:r>
-        <w:rPr>
-          <w:rFonts w:ascii="Garamond" w:hAnsi="Garamond"/>
-        </w:rPr>
-        <w:t xml:space="preserve"> </w:t>
+        <w:t xml:space="preserve">.  </w:t>
       </w:r>
       <w:proofErr w:type="gramStart"/>
       <w:r>
@@ -4396,13 +4348,7 @@
                     <w:rPr>
                       <w:rFonts w:ascii="Cambria Math" w:hAnsi="Cambria Math"/>
                     </w:rPr>
-                    <m:t>e∙</m:t>
-                  </m:r>
-                  <m:r>
-                    <w:rPr>
-                      <w:rFonts w:ascii="Cambria Math" w:hAnsi="Cambria Math"/>
-                    </w:rPr>
-                    <m:t>n</m:t>
+                    <m:t>e∙n</m:t>
                   </m:r>
                 </m:num>
                 <m:den>
@@ -4479,6 +4425,9 @@
             </m:e>
           </m:nary>
           <m:r>
+            <m:rPr>
+              <m:sty m:val="p"/>
+            </m:rPr>
             <w:rPr>
               <w:rFonts w:ascii="Cambria Math" w:hAnsi="Cambria Math"/>
             </w:rPr>
@@ -4508,19 +4457,7 @@
                 <w:rPr>
                   <w:rFonts w:ascii="Cambria Math" w:hAnsi="Cambria Math"/>
                 </w:rPr>
-                <m:t>j</m:t>
-              </m:r>
-              <m:r>
-                <w:rPr>
-                  <w:rFonts w:ascii="Cambria Math" w:hAnsi="Cambria Math"/>
-                </w:rPr>
-                <m:t>=</m:t>
-              </m:r>
-              <m:r>
-                <w:rPr>
-                  <w:rFonts w:ascii="Cambria Math" w:hAnsi="Cambria Math"/>
-                </w:rPr>
-                <m:t>i</m:t>
+                <m:t>j=i</m:t>
               </m:r>
             </m:sub>
             <m:sup>
@@ -4639,13 +4576,7 @@
           <w:rPr>
             <w:rFonts w:ascii="Cambria Math" w:hAnsi="Cambria Math"/>
           </w:rPr>
-          <m:t>s=</m:t>
-        </m:r>
-        <m:r>
-          <w:rPr>
-            <w:rFonts w:ascii="Cambria Math" w:hAnsi="Cambria Math"/>
-          </w:rPr>
-          <m:t>2</m:t>
+          <m:t>s=2</m:t>
         </m:r>
       </m:oMath>
     </w:p>
@@ -5134,19 +5065,7 @@
                 <w:rPr>
                   <w:rFonts w:ascii="Cambria Math" w:hAnsi="Cambria Math"/>
                 </w:rPr>
-                <m:t>j</m:t>
-              </m:r>
-              <m:r>
-                <w:rPr>
-                  <w:rFonts w:ascii="Cambria Math" w:hAnsi="Cambria Math"/>
-                </w:rPr>
-                <m:t>=</m:t>
-              </m:r>
-              <m:r>
-                <w:rPr>
-                  <w:rFonts w:ascii="Cambria Math" w:hAnsi="Cambria Math"/>
-                </w:rPr>
-                <m:t>n</m:t>
+                <m:t>j=n</m:t>
               </m:r>
             </m:sub>
             <m:sup>
@@ -5206,19 +5125,7 @@
           <w:rPr>
             <w:rFonts w:ascii="Cambria Math" w:hAnsi="Cambria Math"/>
           </w:rPr>
-          <m:t>i=0</m:t>
-        </m:r>
-        <m:r>
-          <w:rPr>
-            <w:rFonts w:ascii="Cambria Math" w:hAnsi="Cambria Math"/>
-          </w:rPr>
-          <m:t>→</m:t>
-        </m:r>
-        <m:r>
-          <w:rPr>
-            <w:rFonts w:ascii="Cambria Math" w:hAnsi="Cambria Math"/>
-          </w:rPr>
-          <m:t xml:space="preserve"> j=n</m:t>
+          <m:t>i=0→ j=n</m:t>
         </m:r>
       </m:oMath>
       <w:r>
@@ -5267,7 +5174,19 @@
         <w:rPr>
           <w:rFonts w:ascii="Garamond" w:hAnsi="Garamond"/>
         </w:rPr>
-        <w:t xml:space="preserve"> decreases. When can then reverse the sum since the order of the summation doesn’t matter.</w:t>
+        <w:t xml:space="preserve"> decreases. W</w:t>
+      </w:r>
+      <w:r>
+        <w:rPr>
+          <w:rFonts w:ascii="Garamond" w:hAnsi="Garamond"/>
+        </w:rPr>
+        <w:t>e</w:t>
+      </w:r>
+      <w:r>
+        <w:rPr>
+          <w:rFonts w:ascii="Garamond" w:hAnsi="Garamond"/>
+        </w:rPr>
+        <w:t xml:space="preserve"> can then reverse the sum since the order of the summation doesn’t matter.</w:t>
       </w:r>
     </w:p>
     <w:p>
@@ -5356,13 +5275,7 @@
                 <w:rPr>
                   <w:rFonts w:ascii="Cambria Math" w:hAnsi="Cambria Math"/>
                 </w:rPr>
-                <m:t>j=</m:t>
-              </m:r>
-              <m:r>
-                <w:rPr>
-                  <w:rFonts w:ascii="Cambria Math" w:hAnsi="Cambria Math"/>
-                </w:rPr>
-                <m:t>1</m:t>
+                <m:t>j=1</m:t>
               </m:r>
             </m:sub>
             <m:sup>

</xml_diff>